<commit_message>
Support default template filters
</commit_message>
<xml_diff>
--- a/template-builder-document-api-v2-demo/public/parser-test-document.docx
+++ b/template-builder-document-api-v2-demo/public/parser-test-document.docx
@@ -874,14 +874,112 @@
     </w:tbl>
     <w:p>
       <w:pPr>
-        <w:pStyle w:val="TextBody"/>
-        <w:bidi w:val="0"/>
-        <w:spacing w:before="0" w:after="283"/>
-        <w:jc w:val="start"/>
-        <w:rPr/>
-      </w:pPr>
-      <w:r>
-        <w:rPr/>
+        <w:pStyle w:val="Heading2"/>
+        <w:bidi w:val="0"/>
+        <w:jc w:val="start"/>
+        <w:rPr/>
+      </w:pPr>
+      <w:r>
+        <w:rPr/>
+        <w:t>11. Default for false-like values</w:t>
+      </w:r>
+    </w:p>
+    <w:p>
+      <w:pPr>
+        <w:pStyle w:val="TextBodycallout"/>
+        <w:pBdr>
+          <w:left w:val="single" w:sz="32" w:space="10" w:color="2563EB"/>
+        </w:pBdr>
+        <w:shd w:fill="EEF4FB" w:val="clear"/>
+        <w:bidi w:val="0"/>
+        <w:spacing w:before="0" w:after="120"/>
+        <w:jc w:val="start"/>
+        <w:rPr/>
+      </w:pPr>
+      <w:r>
+        <w:rPr>
+          <w:rStyle w:val="StrongEmphasis"/>
+        </w:rPr>
+        <w:t>Test:</w:t>
+      </w:r>
+      <w:r>
+        <w:rPr/>
+        <w:t xml:space="preserve"> Use fallback text when a value is missing, empty, false, or otherwise false-like.</w:t>
+      </w:r>
+    </w:p>
+    <w:p>
+      <w:pPr>
+        <w:pStyle w:val="TextBodytemplate"/>
+        <w:pBdr>
+          <w:top w:val="single" w:sz="8" w:space="7" w:color="D9DEE7"/>
+          <w:left w:val="single" w:sz="8" w:space="9" w:color="D9DEE7"/>
+          <w:bottom w:val="single" w:sz="8" w:space="7" w:color="D9DEE7"/>
+          <w:right w:val="single" w:sz="8" w:space="9" w:color="D9DEE7"/>
+        </w:pBdr>
+        <w:shd w:fill="F7F8FA" w:val="clear"/>
+        <w:bidi w:val="0"/>
+        <w:spacing w:before="0" w:after="160"/>
+        <w:jc w:val="start"/>
+        <w:rPr/>
+      </w:pPr>
+      <w:r>
+        <w:rPr/>
+        <w:t>Special instructions: {{ special_instructions | default('None', true) }}</w:t>
+      </w:r>
+    </w:p>
+    <w:p>
+      <w:pPr>
+        <w:pStyle w:val="Heading2"/>
+        <w:bidi w:val="0"/>
+        <w:jc w:val="start"/>
+        <w:rPr/>
+      </w:pPr>
+      <w:r>
+        <w:rPr/>
+        <w:t>12. Default for undefined values only</w:t>
+      </w:r>
+    </w:p>
+    <w:p>
+      <w:pPr>
+        <w:pStyle w:val="TextBodycallout"/>
+        <w:pBdr>
+          <w:left w:val="single" w:sz="32" w:space="10" w:color="2563EB"/>
+        </w:pBdr>
+        <w:shd w:fill="EEF4FB" w:val="clear"/>
+        <w:bidi w:val="0"/>
+        <w:spacing w:before="0" w:after="120"/>
+        <w:jc w:val="start"/>
+        <w:rPr/>
+      </w:pPr>
+      <w:r>
+        <w:rPr>
+          <w:rStyle w:val="StrongEmphasis"/>
+        </w:rPr>
+        <w:t>Test:</w:t>
+      </w:r>
+      <w:r>
+        <w:rPr/>
+        <w:t xml:space="preserve"> Preserve an existing false-like value and use fallback text only when the variable is undefined.</w:t>
+      </w:r>
+    </w:p>
+    <w:p>
+      <w:pPr>
+        <w:pStyle w:val="TextBodytemplate"/>
+        <w:pBdr>
+          <w:top w:val="single" w:sz="8" w:space="7" w:color="D9DEE7"/>
+          <w:left w:val="single" w:sz="8" w:space="9" w:color="D9DEE7"/>
+          <w:bottom w:val="single" w:sz="8" w:space="7" w:color="D9DEE7"/>
+          <w:right w:val="single" w:sz="8" w:space="9" w:color="D9DEE7"/>
+        </w:pBdr>
+        <w:shd w:fill="F7F8FA" w:val="clear"/>
+        <w:bidi w:val="0"/>
+        <w:spacing w:before="0" w:after="160"/>
+        <w:jc w:val="start"/>
+        <w:rPr/>
+      </w:pPr>
+      <w:r>
+        <w:rPr/>
+        <w:t>Timeline reference: {{ timeline_reference | default('above', false) }}</w:t>
       </w:r>
     </w:p>
     <w:sectPr>

</xml_diff>